<commit_message>
Implement SCR (standardised claim ratios) via indirect age-sex standardisation
- Add compute_scr.py: indirect age-sex standardisation using NDB national
  sex-age tables and e-Stat prefecture population data (18 harmonised age groups)
- SCR results: analgesic 2.33-fold variation (63.6-147.9), neuropathic 2.04-fold
  (74.7-152.0) — variation persists after demographic adjustment
- Update EN/JA manuscript scripts to load SCR data, add Methods subsection
  (age-sex standardisation), add Results subsection (SCR findings)
- Replace limitations paragraph: 'SCR not available' → 'SCR confirms variation;
  individual-level confounders remain unmeasured'
- Abstract updated with SCR mention (300/300 words)
- Verify figure/citation ordering: all sequential, all cited, all placed
  immediately after first-mention paragraph
- Regenerate all 10 output files

Co-Authored-By: Tatsuki Onishi <bougtoir@gmail.com>
</commit_message>
<xml_diff>
--- a/ndb-pain-regional-variation-japan/output/lancet_rh_wp/LRH_manuscript_EN.docx
+++ b/ndb-pain-regional-variation-japan/output/lancet_rh_wp/LRH_manuscript_EN.docx
@@ -72,7 +72,7 @@
         <w:t xml:space="preserve">Background </w:t>
       </w:r>
       <w:r>
-        <w:t>Clinicians frequently rely on cultural labels—such as “Japanese patients are stoic”—when estimating analgesic requirements. Yet whether pain-related prescribing actually varies within Japan has not been examined at the population level. Japan’s National Database of Health Insurance Claims (NDB) provides population-complete prescribing data that enables direct testing of whether cultural labels predict analgesic use across all 47 prefectures.</w:t>
+        <w:t>Clinicians frequently rely on cultural labels—such as “Japanese patients are stoic”—when estimating analgesic requirements, yet whether pain-related prescribing varies within Japan has not been examined at the population level. Japan’s National Database of Health Insurance Claims (NDB) provides population-complete prescribing data enabling direct testing of whether cultural labels predict analgesic use.</w:t>
       </w:r>
     </w:p>
     <w:p>
@@ -83,7 +83,7 @@
         <w:t xml:space="preserve">Methods </w:t>
       </w:r>
       <w:r>
-        <w:t>This ecological study used the 10th edition of Japan’s NDB Open Data (population-complete insurance claims, April 2023–March 2024) to map pain-related prescribing across all 47 prefectures and nine regional blocks. Phase 1 examined acute perioperative analgesic prescribing (NSAIDs, opioid alkaloids, synthetic narcotics) per inpatient surgery. Phase 2 examined outpatient neuropathic pain drug prescribing (pregabalin, mirogabalin, duloxetine, tramadol, neurotropin) as a chronic postsurgical pain (CPSP) proxy, adjusted for confounding diseases (diabetic neuropathy, postherpetic neuralgia, depression, anxiety) using multiple regression. Per-capita rates supplemented per-surgery indices.</w:t>
+        <w:t>This ecological study used the 10th edition of Japan’s NDB Open Data (population-complete insurance claims, April 2023–March 2024) to map pain-related prescribing across all 47 prefectures and nine regional blocks. Phase 1 examined acute perioperative analgesic prescribing (NSAIDs, opioid alkaloids, synthetic narcotics) per inpatient surgery. Phase 2 examined outpatient neuropathic pain drug prescribing (pregabalin, mirogabalin, duloxetine, tramadol, neurotropin) as a chronic postsurgical pain (CPSP) proxy, adjusted for confounding diseases (diabetic neuropathy, postherpetic neuralgia, depression, anxiety) using multiple regression. Standardised claim ratios (SCR) using indirect age-sex standardisation confirmed findings independent of demographic composition.</w:t>
       </w:r>
     </w:p>
     <w:p>
@@ -94,7 +94,7 @@
         <w:t xml:space="preserve">Findings </w:t>
       </w:r>
       <w:r>
-        <w:t>In Phase 1, the inpatient analgesic-per-surgery index varied 1·97-fold across prefectures (Gifu 25·20 to Kagoshima 49·75; Kruskal–Wallis P&lt;0·001). Tohoku—traditionally considered Japan’s most stoic region—prescribed more, not fewer, analgesics (mean 39·97 vs non-Tohoku 35·17; Cohen’s d=0·87), and this pattern was consistent across all three drug classes. In Phase 2, unadjusted neuropathic pain prescribing showed a large Tohoku excess (d=2.81), but diabetes drug prescribing was a strong confounder (r=0·87). After adjustment for all four disease proxies, the Tohoku effect was attenuated by 84% and became nonsignificant (P=0.32).</w:t>
+        <w:t>In Phase 1, the inpatient analgesic-per-surgery index varied 1·97-fold across prefectures (Gifu 25·20 to Kagoshima 49·75; Kruskal–Wallis P&lt;0·001). Tohoku—traditionally considered Japan’s most stoic region—prescribed more, not fewer, analgesics (mean 39·97 vs non-Tohoku 35·17; Cohen’s d=0·87), and this pattern was consistent across all three drug classes. In Phase 2, unadjusted neuropathic pain prescribing showed a large Tohoku excess (d=2.81), but diabetes drug prescribing was a strong confounder (r=0·87). After adjustment for all four disease proxies, the Tohoku effect was attenuated by 84% and became nonsignificant (P=0.32). SCR confirmed 2.33-fold variation in analgesic prescribing after age-sex standardisation.</w:t>
       </w:r>
     </w:p>
     <w:p>
@@ -157,7 +157,7 @@
         <w:t xml:space="preserve">Added value of this study </w:t>
       </w:r>
       <w:r>
-        <w:t>Using Japan’s NDB Open Data covering the entire insured population (≈125 million people), we found 1·97-fold variation in acute perioperative analgesic prescribing and substantial regional clustering. Tohoku—traditionally perceived as Japan’s most stoic region—prescribed more analgesics, not fewer. The apparent Tohoku excess in neuropathic pain prescribing was largely explained by confounding disease prevalence (especially diabetes), demonstrating that ecological pain studies must adjust for disease confounders. Per-capita neuropathic pain prescribing rates confirmed the prefecture-level heterogeneity.</w:t>
+        <w:t>Using Japan’s NDB Open Data covering the entire insured population (≈125 million people), we found 1·97-fold variation in acute perioperative analgesic prescribing and substantial regional clustering. Tohoku—traditionally perceived as Japan’s most stoic region—prescribed more analgesics, not fewer. The apparent Tohoku excess in neuropathic pain prescribing was largely explained by confounding disease prevalence (especially diabetes), demonstrating that ecological pain studies must adjust for disease confounders. Per-capita neuropathic pain prescribing rates and age-sex standardised claim ratios confirmed the prefecture-level heterogeneity.</w:t>
       </w:r>
     </w:p>
     <w:p>
@@ -412,7 +412,7 @@
         <w:t>11</w:t>
       </w:r>
       <w:r>
-        <w:t xml:space="preserve"> The NDB captures claims from all insurers within Japan’s universal coverage system, encompassing approximately 125 million insured individuals. Aggregate prescription and procedure data are published at the prefecture level (n=47) with suppression of cells containing fewer than ten events. Prefecture-level population estimates from the Statistics Bureau of Japan were used to compute per-capita rates.</w:t>
+        <w:t xml:space="preserve"> The NDB captures claims from all insurers within Japan’s universal coverage system, encompassing approximately 125 million insured individuals. Aggregate prescription and procedure data are published at the prefecture level (n=47) with suppression of cells containing fewer than ten events. Prefecture-level population estimates (October 2023, by five-year age group and sex) from the Statistics Bureau of Japan were used to compute per-capita rates and standardised claim ratios (SCR).</w:t>
       </w:r>
     </w:p>
     <w:p>
@@ -543,6 +543,33 @@
     <w:p>
       <w:r>
         <w:t>The adjusted CPSP index was derived as residuals from regressing neuropathic pain prescribing on the four confounder proxies. Pearson and Spearman correlations assessed inter-index relationships. All analyses used Python 3.11 (NumPy 1.24, SciPy 1.11, matplotlib 3.8).</w:t>
+      </w:r>
+    </w:p>
+    <w:p>
+      <w:pPr>
+        <w:pStyle w:val="Heading2"/>
+      </w:pPr>
+      <w:r>
+        <w:rPr>
+          <w:rFonts w:ascii="Times New Roman" w:hAnsi="Times New Roman"/>
+          <w:color w:val="000000"/>
+        </w:rPr>
+        <w:t>Age-sex standardisation</w:t>
+      </w:r>
+    </w:p>
+    <w:p>
+      <w:r>
+        <w:t>Standardised claim ratios (SCR) were computed by indirect age-sex standardisation, following the method of Taira et al.</w:t>
+      </w:r>
+      <w:r>
+        <w:rPr>
+          <w:sz w:val="20"/>
+          <w:vertAlign w:val="superscript"/>
+        </w:rPr>
+        <w:t>14</w:t>
+      </w:r>
+      <w:r>
+        <w:t xml:space="preserve"> National age-sex-specific prescription rates (18 five-year age groups × 2 sexes) from the NDB sex-age table were applied to each prefecture’s population structure from the October 2023 population estimates. SCR = (observed / expected) × 100, where expected is the sum of national age-sex rates weighted by the prefecture’s demographic composition.</w:t>
       </w:r>
     </w:p>
     <w:p>
@@ -1860,6 +1887,23 @@
     </w:p>
     <w:p>
       <w:pPr>
+        <w:pStyle w:val="Heading2"/>
+      </w:pPr>
+      <w:r>
+        <w:rPr>
+          <w:rFonts w:ascii="Times New Roman" w:hAnsi="Times New Roman"/>
+          <w:color w:val="000000"/>
+        </w:rPr>
+        <w:t>Age-sex standardised claim ratios</w:t>
+      </w:r>
+    </w:p>
+    <w:p>
+      <w:r>
+        <w:t>After indirect age-sex standardisation, inpatient analgesic SCR ranged from 63.6 to 147.9 (2.33-fold variation), confirming that the prescribing heterogeneity was not attributable to differences in prefectural age-sex composition. Outpatient neuropathic pain drug SCR ranged from 74.7 to 152.0 (2.04-fold). Tohoku retained elevated neuropathic pain SCR (mean 126.3) relative to non-Tohoku prefectures (96.3), consistent with the crude analysis.</w:t>
+      </w:r>
+    </w:p>
+    <w:p>
+      <w:pPr>
         <w:pStyle w:val="Heading1"/>
       </w:pPr>
       <w:r>
@@ -2070,17 +2114,7 @@
     </w:p>
     <w:p>
       <w:r>
-        <w:t>The main limitations are inherent to the ecological design. The unit of analysis is the prefecture, not the individual patient; ecological correlations may not reflect individual-level associations (ecological fallacy). NDB Open Data do not contain diagnosis codes, so CPSP cannot be directly identified; the neuropathic pain drug proxy captures all indications, not CPSP specifically. Drug prescribing proxies may not capture disease prevalence accurately (eg, fibromyalgia has no specific drug proxy and shares pregabalin as first-line treatment). The cross-sectional design cannot distinguish temporal sequences (surgery → acute pain → CPSP), and unmeasured confounders such as age distribution, surgical case mix, and regional prescribing culture may contribute to residual variation. Age-sex stratified data were not available at the drug-prefecture level in the current NDB release, precluding computation of standardised claim ratios as used by Taira et al;</w:t>
-      </w:r>
-      <w:r>
-        <w:rPr>
-          <w:sz w:val="20"/>
-          <w:vertAlign w:val="superscript"/>
-        </w:rPr>
-        <w:t>14</w:t>
-      </w:r>
-      <w:r>
-        <w:t xml:space="preserve"> future editions may enable this refinement.</w:t>
+        <w:t>The main limitations are inherent to the ecological design. The unit of analysis is the prefecture, not the individual patient; ecological correlations may not reflect individual-level associations (ecological fallacy). NDB Open Data do not contain diagnosis codes, so CPSP cannot be directly identified; the neuropathic pain drug proxy captures all indications, not CPSP specifically. Drug prescribing proxies may not capture disease prevalence accurately (eg, fibromyalgia has no specific drug proxy and shares pregabalin as first-line treatment). The cross-sectional design cannot distinguish temporal sequences (surgery → acute pain → CPSP), and unmeasured confounders such as surgical case mix and regional prescribing culture may contribute to residual variation. Although indirect age-sex standardisation via SCR confirmed that demographic composition did not explain the observed heterogeneity, individual-level confounders remain unmeasured in the aggregate NDB data.</w:t>
       </w:r>
     </w:p>
     <w:p>

</xml_diff>

<commit_message>
Add 'Regional stigma in an era of mobility' to Discussion
- New subsection argues that domestic migration, urbanisation, and medical
  tourism render region-based stereotyping untenable
- Medicine must be an encounter between clinician and individual patient,
  not between clinician and cultural category
- Individualised assessment (pain scales, objective monitoring) as the only
  reliable basis for prescribing in a mobile, multicultural world
- EN/JA manuscripts and cover letter regenerated
- Body word count: 2,905/3,500

Co-Authored-By: Tatsuki Onishi <bougtoir@gmail.com>
</commit_message>
<xml_diff>
--- a/ndb-pain-regional-variation-japan/output/lancet_rh_wp/LRH_manuscript_EN.docx
+++ b/ndb-pain-regional-variation-japan/output/lancet_rh_wp/LRH_manuscript_EN.docx
@@ -2126,12 +2126,29 @@
           <w:rFonts w:ascii="Times New Roman" w:hAnsi="Times New Roman"/>
           <w:color w:val="000000"/>
         </w:rPr>
+        <w:t>Regional stigma in an era of mobility</w:t>
+      </w:r>
+    </w:p>
+    <w:p>
+      <w:r>
+        <w:t>Beyond the statistical evidence, the very premise of region-based stereotyping is increasingly untenable in contemporary Japan and across the Western Pacific. Domestic migration, urbanisation, and an ageing workforce have fundamentally reshaped the demographic composition of every prefecture. A patient presenting in a Tokyo emergency department may have been born in Aomori, educated in Osaka, and working in Yokohama—rendering any assumption based on their prefecture of residence meaningless. Internationally, the growth of medical tourism and expatriate healthcare in the Asia-Pacific region means that clinicians encounter patients from diverse cultural backgrounds with increasing frequency. In this context, applying regional or national stereotypes—whether “Tohoku patients are stoic” or “Japanese patients tolerate pain well”—is not merely inaccurate but potentially harmful. Medicine is, and must remain, an encounter between a clinician and an individual patient—not between a clinician and a cultural category. Individualised assessment—through structured pain scales, functional outcome measures, and, where available, objective nociception monitoring—provides the only reliable basis for analgesic decision-making in a mobile, multicultural world.</w:t>
+      </w:r>
+    </w:p>
+    <w:p>
+      <w:pPr>
+        <w:pStyle w:val="Heading2"/>
+      </w:pPr>
+      <w:r>
+        <w:rPr>
+          <w:rFonts w:ascii="Times New Roman" w:hAnsi="Times New Roman"/>
+          <w:color w:val="000000"/>
+        </w:rPr>
         <w:t>Implications and future directions</w:t>
       </w:r>
     </w:p>
     <w:p>
       <w:r>
-        <w:t>This exploratory study demonstrates that Japan’s NDB Open Data can serve as a hypothesis-generating platform for population-level pain research. Future studies using the NDB sampling dataset (Level 3 access) could enable individual-level longitudinal tracking from surgery to new neuropathic pain prescriptions, providing a direct CPSP measure. Procedure-specific analyses (eg, total knee arthroplasty, mastectomy) would reduce surgical case-mix confounding. From an international perspective, replicating this within-country ecological framework in other nations with national claims databases (eg, South Korea, Taiwan, the UK) would test whether within-country prescribing heterogeneity is the rule rather than the exception—further undermining the validity of national-level cultural stereotypes in clinical decision-making. Prospective studies examining how cultural assumptions influence analgesic prescribing in multicultural clinical settings would directly test whether stereotyped labels translate into therapeutic disadvantage. Such research is increasingly urgent as global migration and medical tourism expose more patients to healthcare systems unfamiliar with their cultural background.</w:t>
+        <w:t>This exploratory study demonstrates that Japan’s NDB Open Data can serve as a hypothesis-generating platform for population-level pain research. Future studies using the NDB sampling dataset (Level 3 access) could enable individual-level longitudinal tracking from surgery to new neuropathic pain prescriptions, providing a direct CPSP measure. Procedure-specific analyses (eg, total knee arthroplasty, mastectomy) would reduce surgical case-mix confounding. From an international perspective, replicating this within-country ecological framework in other nations with national claims databases (eg, South Korea, Taiwan, the UK) would test whether within-country prescribing heterogeneity is the rule rather than the exception—further undermining the validity of national-level cultural stereotypes in clinical decision-making.</w:t>
       </w:r>
     </w:p>
     <w:p>

</xml_diff>

<commit_message>
Remove embedded figures from manuscripts; figures as independent TIFF files
- Replaced inline embedded PNG figures with '[Insert Figure X here]' placeholders
- Figures to be submitted as separate TIFF files (300 DPI, RGB, LZW)
- Captions retained in manuscript text
- Applied to both EN and JA manuscripts

Co-Authored-By: Tatsuki Onishi <bougtoir@gmail.com>
</commit_message>
<xml_diff>
--- a/ndb-pain-regional-variation-japan/output/lancet_rh_wp/LRH_manuscript_EN.docx
+++ b/ndb-pain-regional-variation-japan/output/lancet_rh_wp/LRH_manuscript_EN.docx
@@ -1227,46 +1227,20 @@
     </w:p>
     <w:p>
       <w:pPr>
+        <w:spacing w:before="480" w:after="120"/>
         <w:jc w:val="center"/>
       </w:pPr>
       <w:r>
-        <w:drawing>
-          <wp:inline xmlns:a="http://schemas.openxmlformats.org/drawingml/2006/main" xmlns:pic="http://schemas.openxmlformats.org/drawingml/2006/picture">
-            <wp:extent cx="5029200" cy="2180374"/>
-            <wp:docPr id="1" name="Picture 1"/>
-            <wp:cNvGraphicFramePr>
-              <a:graphicFrameLocks noChangeAspect="1"/>
-            </wp:cNvGraphicFramePr>
-            <a:graphic>
-              <a:graphicData uri="http://schemas.openxmlformats.org/drawingml/2006/picture">
-                <pic:pic>
-                  <pic:nvPicPr>
-                    <pic:cNvPr id="0" name="fig1_neuropathic_unadjusted_en.png"/>
-                    <pic:cNvPicPr/>
-                  </pic:nvPicPr>
-                  <pic:blipFill>
-                    <a:blip r:embed="rId10"/>
-                    <a:stretch>
-                      <a:fillRect/>
-                    </a:stretch>
-                  </pic:blipFill>
-                  <pic:spPr>
-                    <a:xfrm>
-                      <a:off x="0" y="0"/>
-                      <a:ext cx="5029200" cy="2180374"/>
-                    </a:xfrm>
-                    <a:prstGeom prst="rect"/>
-                  </pic:spPr>
-                </pic:pic>
-              </a:graphicData>
-            </a:graphic>
-          </wp:inline>
-        </w:drawing>
+        <w:rPr>
+          <w:color w:val="808080"/>
+          <w:sz w:val="20"/>
+        </w:rPr>
+        <w:t>[Insert Figure 1 here]</w:t>
       </w:r>
     </w:p>
     <w:p>
       <w:pPr>
-        <w:spacing w:before="280" w:after="240"/>
+        <w:spacing w:before="120" w:after="240"/>
       </w:pPr>
       <w:r>
         <w:rPr>
@@ -1301,46 +1275,20 @@
     </w:p>
     <w:p>
       <w:pPr>
+        <w:spacing w:before="480" w:after="120"/>
         <w:jc w:val="center"/>
       </w:pPr>
       <w:r>
-        <w:drawing>
-          <wp:inline xmlns:a="http://schemas.openxmlformats.org/drawingml/2006/main" xmlns:pic="http://schemas.openxmlformats.org/drawingml/2006/picture">
-            <wp:extent cx="5029200" cy="4523868"/>
-            <wp:docPr id="2" name="Picture 2"/>
-            <wp:cNvGraphicFramePr>
-              <a:graphicFrameLocks noChangeAspect="1"/>
-            </wp:cNvGraphicFramePr>
-            <a:graphic>
-              <a:graphicData uri="http://schemas.openxmlformats.org/drawingml/2006/picture">
-                <pic:pic>
-                  <pic:nvPicPr>
-                    <pic:cNvPr id="0" name="fig2_confounder_correlations_en.png"/>
-                    <pic:cNvPicPr/>
-                  </pic:nvPicPr>
-                  <pic:blipFill>
-                    <a:blip r:embed="rId11"/>
-                    <a:stretch>
-                      <a:fillRect/>
-                    </a:stretch>
-                  </pic:blipFill>
-                  <pic:spPr>
-                    <a:xfrm>
-                      <a:off x="0" y="0"/>
-                      <a:ext cx="5029200" cy="4523868"/>
-                    </a:xfrm>
-                    <a:prstGeom prst="rect"/>
-                  </pic:spPr>
-                </pic:pic>
-              </a:graphicData>
-            </a:graphic>
-          </wp:inline>
-        </w:drawing>
+        <w:rPr>
+          <w:color w:val="808080"/>
+          <w:sz w:val="20"/>
+        </w:rPr>
+        <w:t>[Insert Figure 2 here]</w:t>
       </w:r>
     </w:p>
     <w:p>
       <w:pPr>
-        <w:spacing w:before="280" w:after="240"/>
+        <w:spacing w:before="120" w:after="240"/>
       </w:pPr>
       <w:r>
         <w:rPr>
@@ -1813,46 +1761,20 @@
     </w:p>
     <w:p>
       <w:pPr>
+        <w:spacing w:before="480" w:after="120"/>
         <w:jc w:val="center"/>
       </w:pPr>
       <w:r>
-        <w:drawing>
-          <wp:inline xmlns:a="http://schemas.openxmlformats.org/drawingml/2006/main" xmlns:pic="http://schemas.openxmlformats.org/drawingml/2006/picture">
-            <wp:extent cx="5029200" cy="2182483"/>
-            <wp:docPr id="3" name="Picture 3"/>
-            <wp:cNvGraphicFramePr>
-              <a:graphicFrameLocks noChangeAspect="1"/>
-            </wp:cNvGraphicFramePr>
-            <a:graphic>
-              <a:graphicData uri="http://schemas.openxmlformats.org/drawingml/2006/picture">
-                <pic:pic>
-                  <pic:nvPicPr>
-                    <pic:cNvPr id="0" name="fig4_region_unadj_vs_adj_en.png"/>
-                    <pic:cNvPicPr/>
-                  </pic:nvPicPr>
-                  <pic:blipFill>
-                    <a:blip r:embed="rId12"/>
-                    <a:stretch>
-                      <a:fillRect/>
-                    </a:stretch>
-                  </pic:blipFill>
-                  <pic:spPr>
-                    <a:xfrm>
-                      <a:off x="0" y="0"/>
-                      <a:ext cx="5029200" cy="2182483"/>
-                    </a:xfrm>
-                    <a:prstGeom prst="rect"/>
-                  </pic:spPr>
-                </pic:pic>
-              </a:graphicData>
-            </a:graphic>
-          </wp:inline>
-        </w:drawing>
+        <w:rPr>
+          <w:color w:val="808080"/>
+          <w:sz w:val="20"/>
+        </w:rPr>
+        <w:t>[Insert Figure 3 here]</w:t>
       </w:r>
     </w:p>
     <w:p>
       <w:pPr>
-        <w:spacing w:before="280" w:after="240"/>
+        <w:spacing w:before="120" w:after="240"/>
       </w:pPr>
       <w:r>
         <w:rPr>

</xml_diff>